<commit_message>
chore: Rebrand application to Aligne
</commit_message>
<xml_diff>
--- a/HANDOVER_DOCS_DOCX/00_NON_TECHNICAL_PROJECT_OVERVIEW.docx
+++ b/HANDOVER_DOCS_DOCX/00_NON_TECHNICAL_PROJECT_OVERVIEW.docx
@@ -25,7 +25,7 @@
         <w:pStyle w:val="FirstParagraph"/>
       </w:pPr>
       <w:r>
-        <w:t xml:space="preserve">This project is an internal management system named Citydent IMS. It manages patients, appointments, treatments, invoicing, laboratory submissions, inventory, human resources, and learning materials for a dental practice.</w:t>
+        <w:t xml:space="preserve">This project is an internal management system named Aligne. It manages patients, appointments, treatments, invoicing, laboratory submissions, inventory, human resources, and learning materials for a dental practice.</w:t>
       </w:r>
     </w:p>
     <w:bookmarkEnd w:id="9"/>
@@ -723,7 +723,7 @@
         <w:pStyle w:val="FirstParagraph"/>
       </w:pPr>
       <w:r>
-        <w:t xml:space="preserve">Citydent IMS is a robust application for dental practice management. It relies on a PostgreSQL database and Firebase. Backups must be prioritized to ensure business continuity.</w:t>
+        <w:t xml:space="preserve">Aligne is a robust application for dental practice management. It relies on a PostgreSQL database and Firebase. Backups must be prioritized to ensure business continuity.</w:t>
       </w:r>
     </w:p>
     <w:bookmarkEnd w:id="22"/>

</xml_diff>